<commit_message>
Final DDAS report v2: figures occupy ~55%, minimal text
- Larger figures (14cm full-width, 6.4cm side-by-side)
- Text reduced to 2-3 sentences per section
- Figure 1: AOT Price + Tourist Arrivals (full width)
- Figure 2a+2b: Network graph + Centrality ranking (side by side)
- Figure 4: Actual vs predicted (full width)
- Tighter margins (1.8/2.2cm) for more figure space
- Professional graduate-analytics layout
</commit_message>
<xml_diff>
--- a/reports/AOT_DDAS_Final_Report.docx
+++ b/reports/AOT_DDAS_Final_Report.docx
@@ -4,7 +4,7 @@
   <w:body>
     <w:p>
       <w:pPr>
-        <w:spacing w:after="0" w:before="0" w:line="220" w:lineRule="exact"/>
+        <w:spacing w:after="0" w:before="0" w:line="240" w:lineRule="exact"/>
         <w:jc w:val="center"/>
       </w:pPr>
       <w:r>
@@ -12,7 +12,7 @@
           <w:rFonts w:ascii="Times New Roman" w:hAnsi="Times New Roman" w:eastAsia="Times New Roman"/>
           <w:b/>
           <w:i w:val="0"/>
-          <w:sz w:val="26"/>
+          <w:sz w:val="24"/>
         </w:rPr>
         <w:t>Social Network Analysis of Factors Influencing AOT Stock Price:</w:t>
         <w:br/>
@@ -23,13 +23,13 @@
     </w:p>
     <w:p>
       <w:pPr>
-        <w:spacing w:after="0" w:before="0" w:line="220" w:lineRule="exact"/>
+        <w:spacing w:after="0" w:before="0" w:line="240" w:lineRule="exact"/>
         <w:jc w:val="both"/>
       </w:pPr>
     </w:p>
     <w:p>
       <w:pPr>
-        <w:spacing w:after="0" w:before="0" w:line="220" w:lineRule="exact"/>
+        <w:spacing w:after="0" w:before="0" w:line="240" w:lineRule="exact"/>
         <w:jc w:val="center"/>
       </w:pPr>
       <w:r>
@@ -44,7 +44,7 @@
     </w:p>
     <w:p>
       <w:pPr>
-        <w:spacing w:after="0" w:before="0" w:line="220" w:lineRule="exact"/>
+        <w:spacing w:after="0" w:before="0" w:line="240" w:lineRule="exact"/>
         <w:jc w:val="center"/>
       </w:pPr>
       <w:r>
@@ -54,12 +54,12 @@
           <w:i w:val="0"/>
           <w:sz w:val="20"/>
         </w:rPr>
-        <w:t>First Name:  _________________    Last Name:  _________________</w:t>
+        <w:t>First Name: _________________     Last Name: _________________</w:t>
       </w:r>
     </w:p>
     <w:p>
       <w:pPr>
-        <w:spacing w:after="80" w:before="0" w:line="220" w:lineRule="exact"/>
+        <w:spacing w:after="80" w:before="0" w:line="240" w:lineRule="exact"/>
         <w:jc w:val="center"/>
       </w:pPr>
       <w:r>
@@ -69,12 +69,12 @@
           <w:i w:val="0"/>
           <w:sz w:val="20"/>
         </w:rPr>
-        <w:t>Email:  _________________</w:t>
+        <w:t>Email: _________________</w:t>
       </w:r>
     </w:p>
     <w:p>
       <w:pPr>
-        <w:spacing w:after="40" w:before="80" w:line="220" w:lineRule="exact"/>
+        <w:spacing w:after="20" w:before="120" w:line="240" w:lineRule="exact"/>
         <w:jc w:val="both"/>
       </w:pPr>
       <w:r>
@@ -89,7 +89,7 @@
     </w:p>
     <w:p>
       <w:pPr>
-        <w:spacing w:after="0" w:before="0" w:line="220" w:lineRule="exact"/>
+        <w:spacing w:after="0" w:before="0" w:line="240" w:lineRule="exact"/>
         <w:jc w:val="both"/>
       </w:pPr>
       <w:r>
@@ -99,25 +99,25 @@
           <w:i w:val="0"/>
           <w:sz w:val="20"/>
         </w:rPr>
-        <w:t>This research applies Social Network Analysis (SNA) and supervised machine learning to investigate how macroeconomic and market factors collectively influence the stock price of Airports of Thailand Public Company Limited (AOT). Monthly data from January 2015 to December 2024 (120 observations) was collected from four official Thai data sources: the Stock Exchange of Thailand OAQ system (SET), the Ministry of Tourism and Sports (MOTS), the Bank of Thailand (BOT), and the National Economic and Social Development Council (NESDC). Eight primary variables were selected: AOT closing price and trading volume, the SET Index, international tourist arrivals, the USD/THB exchange rate, the policy rate, headline CPI, and GDP. The study models these factors as nodes in a weighted network graph and evaluates eight model families for one-step-ahead monthly price prediction.</w:t>
+        <w:t>This study applies Social Network Analysis (SNA) and machine learning to quantify how macroeconomic and market factors influence the stock price of Airports of Thailand (AOT). Monthly data (2015–2024, 120 observations) was collected from four official Thai sources: SET, MOTS, BOT, and NESDC. Eight variables — AOT closing price, trading volume, SET Index, tourist arrivals, USD/THB rate, policy rate, CPI, and GDP — are modelled as nodes in a weighted network graph. Thirty-two engineered features were constructed, and eight model families were benchmarked for one-step-ahead prediction.</w:t>
       </w:r>
     </w:p>
     <w:p>
       <w:pPr>
-        <w:spacing w:after="0" w:before="0" w:line="220" w:lineRule="exact"/>
+        <w:spacing w:after="0" w:before="508000" w:line="240" w:lineRule="exact"/>
         <w:jc w:val="both"/>
       </w:pPr>
     </w:p>
     <w:p>
       <w:pPr>
         <w:keepNext/>
-        <w:spacing w:after="0" w:before="0" w:line="220" w:lineRule="exact"/>
+        <w:spacing w:after="0" w:before="0" w:line="200" w:lineRule="exact"/>
         <w:jc w:val="center"/>
       </w:pPr>
       <w:r>
         <w:drawing>
           <wp:inline xmlns:a="http://schemas.openxmlformats.org/drawingml/2006/main" xmlns:pic="http://schemas.openxmlformats.org/drawingml/2006/picture">
-            <wp:extent cx="4680000" cy="2080000"/>
+            <wp:extent cx="5040000" cy="2240000"/>
             <wp:docPr id="1" name="Picture 1"/>
             <wp:cNvGraphicFramePr>
               <a:graphicFrameLocks noChangeAspect="1"/>
@@ -138,7 +138,7 @@
                   <pic:spPr>
                     <a:xfrm>
                       <a:off x="0" y="0"/>
-                      <a:ext cx="4680000" cy="2080000"/>
+                      <a:ext cx="5040000" cy="2240000"/>
                     </a:xfrm>
                     <a:prstGeom prst="rect"/>
                   </pic:spPr>
@@ -151,7 +151,7 @@
     </w:p>
     <w:p>
       <w:pPr>
-        <w:spacing w:after="40" w:before="0" w:line="220" w:lineRule="exact"/>
+        <w:spacing w:after="0" w:before="0" w:line="200" w:lineRule="exact"/>
         <w:jc w:val="center"/>
       </w:pPr>
       <w:r>
@@ -161,12 +161,12 @@
           <w:i/>
           <w:sz w:val="16"/>
         </w:rPr>
-        <w:t>Figure 1: AOT closing price (blue, left axis) and international tourist arrivals (green dashed, right axis), 2015–2024. The co-movement is particularly evident during the COVID-19 pandemic (2020–2021) and subsequent recovery period (2022–2024).</w:t>
+        <w:t>Figure 1: AOT closing price and international tourist arrivals (2015–2024). The dual-axis overlay reveals strong co-movement, particularly during the COVID-19 pandemic and subsequent tourism recovery.</w:t>
       </w:r>
     </w:p>
     <w:p>
       <w:pPr>
-        <w:spacing w:after="40" w:before="60" w:line="220" w:lineRule="exact"/>
+        <w:spacing w:after="20" w:before="120" w:line="240" w:lineRule="exact"/>
         <w:jc w:val="both"/>
       </w:pPr>
       <w:r>
@@ -181,7 +181,7 @@
     </w:p>
     <w:p>
       <w:pPr>
-        <w:spacing w:after="0" w:before="0" w:line="220" w:lineRule="exact"/>
+        <w:spacing w:after="0" w:before="0" w:line="240" w:lineRule="exact"/>
         <w:jc w:val="both"/>
       </w:pPr>
       <w:r>
@@ -191,12 +191,12 @@
           <w:i w:val="0"/>
           <w:sz w:val="20"/>
         </w:rPr>
-        <w:t>From the eight raw variables, 32 engineered features were constructed: monthly returns, log returns, moving averages (windows 3, 6, 12 months), rolling standard deviations, lagged values (lags 1, 3, 6), tourist growth rates, exchange rate changes, and volume changes. All features were computed using only past observations to avoid data leakage. The correlation structure was analysed using Pearson, Spearman, and mutual information measures. A weighted undirected graph was built with edges thresholded at |r| ≥ 0.3, and five centrality metrics (degree, betweenness, closeness, eigenvector, PageRank) were computed. Louvain community detection identified natural groupings among the factors. Eight model families were benchmarked: Linear Regression, Random Forest, XGBoost, LightGBM, CatBoost, ARIMA, Prophet, and a two-layer LSTM network.</w:t>
+        <w:t>Engineered features include monthly and log returns, moving averages (windows 3, 6, 12), rolling standard deviations, lagged values (lags 1, 3, 6), tourist growth rates, and exchange rate changes — all constructed from past data only. The weighted graph was built using Pearson correlations (threshold |r| ≥ 0.3) with Louvain community detection and five centrality metrics (degree, betweenness, closeness, eigenvector, PageRank). Models benchmarked: Linear Regression, Random Forest, XGBoost, LightGBM, CatBoost, ARIMA, Prophet, and LSTM.</w:t>
       </w:r>
     </w:p>
     <w:p>
       <w:pPr>
-        <w:spacing w:after="40" w:before="60" w:line="220" w:lineRule="exact"/>
+        <w:spacing w:after="20" w:before="120" w:line="240" w:lineRule="exact"/>
         <w:jc w:val="both"/>
       </w:pPr>
       <w:r>
@@ -211,7 +211,7 @@
     </w:p>
     <w:p>
       <w:pPr>
-        <w:spacing w:after="0" w:before="0" w:line="220" w:lineRule="exact"/>
+        <w:spacing w:after="0" w:before="0" w:line="240" w:lineRule="exact"/>
         <w:jc w:val="both"/>
       </w:pPr>
       <w:r>
@@ -221,12 +221,12 @@
           <w:i w:val="0"/>
           <w:sz w:val="20"/>
         </w:rPr>
-        <w:t>Existing studies of AOT stock price predominantly rely on univariate time-series models (ARIMA, GARCH) or single-factor regression, which assume factor independence and ignore interdependency structures. These approaches cannot capture feedback loops, indirect effects, or bridging variables through which economic shocks propagate. The motivation for this study is threefold: (1) a network perspective reveals bridge variables with high betweenness centrality through which external shocks propagate; (2) Louvain community detection groups variables into interpretable clusters reflecting market versus macroeconomic domains; (3) augmenting supervised models with network-derived features improves predictive accuracy and interpretability.</w:t>
+        <w:t>Existing AOT price studies depend on univariate models (ARIMA, GARCH) or single-factor regression, assuming factor independence and missing interdependency structures. Three motivations drive this work: (1) SNA identifies bridge variables through which shocks propagate; (2) Louvain clustering reveals interpretable factor groupings; (3) network-augmented features improve both predictive accuracy and interpretability over raw-factor-only models.</w:t>
       </w:r>
     </w:p>
     <w:p>
       <w:pPr>
-        <w:spacing w:after="40" w:before="60" w:line="220" w:lineRule="exact"/>
+        <w:spacing w:after="20" w:before="120" w:line="240" w:lineRule="exact"/>
         <w:jc w:val="both"/>
       </w:pPr>
       <w:r>
@@ -241,7 +241,7 @@
     </w:p>
     <w:p>
       <w:pPr>
-        <w:spacing w:after="0" w:before="0" w:line="220" w:lineRule="exact"/>
+        <w:spacing w:after="0" w:before="0" w:line="240" w:lineRule="exact"/>
         <w:jc w:val="both"/>
       </w:pPr>
       <w:r>
@@ -251,12 +251,12 @@
           <w:i w:val="0"/>
           <w:sz w:val="20"/>
         </w:rPr>
-        <w:t>This study proposes a two-stage analytical framework. Stage I constructs a weighted undirected graph using Pearson correlations among the eight variables, pruned at a threshold of |r| ≥ 0.3. Network metrics (centrality scores, community labels) are computed and used as additional predictors. Stage II trains eight model families on the augmented feature set with a chronological train-validation-test split (102, 6, and 12 months respectively). The best model is selected by validation RMSE and interpreted via SHAP values. All code is implemented in Python 3.12 with scikit-learn, XGBoost, LightGBM, CatBoost, Prophet, and TensorFlow.</w:t>
+        <w:t>Stage I builds a Pearson-correlation graph (threshold |r| ≥ 0.3) and computes centrality metrics and community labels as additional predictors. Stage II trains eight model families on a chronological split (102 train / 6 validation / 12 test months), selecting the best model by validation RMSE and interpreting via SHAP. Implementation uses Python 3.12 with scikit-learn, XGBoost, LightGBM, CatBoost, Prophet, and TensorFlow.</w:t>
       </w:r>
     </w:p>
     <w:p>
       <w:pPr>
-        <w:spacing w:after="0" w:before="0" w:line="220" w:lineRule="exact"/>
+        <w:spacing w:after="0" w:before="508000" w:line="240" w:lineRule="exact"/>
         <w:jc w:val="both"/>
       </w:pPr>
     </w:p>
@@ -267,13 +267,13 @@
         <w:tblLook w:firstColumn="1" w:firstRow="1" w:lastColumn="0" w:lastRow="0" w:noHBand="0" w:noVBand="1" w:val="04A0"/>
       </w:tblPr>
       <w:tblGrid>
-        <w:gridCol w:w="4513"/>
-        <w:gridCol w:w="4513"/>
+        <w:gridCol w:w="4706"/>
+        <w:gridCol w:w="4706"/>
       </w:tblGrid>
       <w:tr>
         <w:tc>
           <w:tcPr>
-            <w:tcW w:type="dxa" w:w="4513"/>
+            <w:tcW w:type="dxa" w:w="4706"/>
             <w:tcBorders>
               <w:top w:val="none" w:sz="0" w:space="0" w:color="auto"/>
               <w:left w:val="none" w:sz="0" w:space="0" w:color="auto"/>
@@ -294,7 +294,7 @@
             <w:r>
               <w:drawing>
                 <wp:inline xmlns:a="http://schemas.openxmlformats.org/drawingml/2006/main" xmlns:pic="http://schemas.openxmlformats.org/drawingml/2006/picture">
-                  <wp:extent cx="1980000" cy="1485000"/>
+                  <wp:extent cx="2304000" cy="1728000"/>
                   <wp:docPr id="2" name="Picture 2"/>
                   <wp:cNvGraphicFramePr>
                     <a:graphicFrameLocks noChangeAspect="1"/>
@@ -315,7 +315,7 @@
                         <pic:spPr>
                           <a:xfrm>
                             <a:off x="0" y="0"/>
-                            <a:ext cx="1980000" cy="1485000"/>
+                            <a:ext cx="2304000" cy="1728000"/>
                           </a:xfrm>
                           <a:prstGeom prst="rect"/>
                         </pic:spPr>
@@ -329,7 +329,7 @@
         </w:tc>
         <w:tc>
           <w:tcPr>
-            <w:tcW w:type="dxa" w:w="4513"/>
+            <w:tcW w:type="dxa" w:w="4706"/>
             <w:tcBorders>
               <w:top w:val="none" w:sz="0" w:space="0" w:color="auto"/>
               <w:left w:val="none" w:sz="0" w:space="0" w:color="auto"/>
@@ -350,7 +350,7 @@
             <w:r>
               <w:drawing>
                 <wp:inline xmlns:a="http://schemas.openxmlformats.org/drawingml/2006/main" xmlns:pic="http://schemas.openxmlformats.org/drawingml/2006/picture">
-                  <wp:extent cx="1980000" cy="1485000"/>
+                  <wp:extent cx="2304000" cy="1728000"/>
                   <wp:docPr id="3" name="Picture 3"/>
                   <wp:cNvGraphicFramePr>
                     <a:graphicFrameLocks noChangeAspect="1"/>
@@ -371,7 +371,7 @@
                         <pic:spPr>
                           <a:xfrm>
                             <a:off x="0" y="0"/>
-                            <a:ext cx="1980000" cy="1485000"/>
+                            <a:ext cx="2304000" cy="1728000"/>
                           </a:xfrm>
                           <a:prstGeom prst="rect"/>
                         </pic:spPr>
@@ -387,7 +387,7 @@
     </w:tbl>
     <w:p>
       <w:pPr>
-        <w:spacing w:after="40" w:before="0" w:line="220" w:lineRule="exact"/>
+        <w:spacing w:after="0" w:before="0" w:line="200" w:lineRule="exact"/>
         <w:jc w:val="center"/>
       </w:pPr>
       <w:r>
@@ -397,12 +397,12 @@
           <w:i/>
           <w:sz w:val="16"/>
         </w:rPr>
-        <w:t>Figure 2: (a) Weighted network graph of the eight factors with Louvain communities coloured. (b) Centrality ranking showing four metrics per variable.</w:t>
+        <w:t>Figure 2: (a) Weighted network graph of eight factors with Louvain communities coloured. (b) Centrality rankings showing degree, betweenness, closeness, and eigenvector scores per variable.</w:t>
       </w:r>
     </w:p>
     <w:p>
       <w:pPr>
-        <w:spacing w:after="40" w:before="60" w:line="220" w:lineRule="exact"/>
+        <w:spacing w:after="20" w:before="120" w:line="240" w:lineRule="exact"/>
         <w:jc w:val="both"/>
       </w:pPr>
       <w:r>
@@ -417,7 +417,7 @@
     </w:p>
     <w:p>
       <w:pPr>
-        <w:spacing w:after="0" w:before="0" w:line="220" w:lineRule="exact"/>
+        <w:spacing w:after="0" w:before="0" w:line="240" w:lineRule="exact"/>
         <w:jc w:val="both"/>
       </w:pPr>
       <w:r>
@@ -427,12 +427,12 @@
           <w:i w:val="0"/>
           <w:sz w:val="20"/>
         </w:rPr>
-        <w:t>Data was split chronologically: 102 months for training, 6 for validation (parameter tuning), and 12 for hold-out testing. All features were standardised (z-score). Tree models used 100–300 estimators with early stopping. The LSTM used two layers (64 and 32 units), dropout 0.2, and a look-back window of 6 months. ARIMA order was selected via AIC minimisation. Prophet used additive seasonality with yearly and monthly components. Evaluation metrics were RMSE, MAE, MAPE, and R².</w:t>
+        <w:t>Chronological split: 102 months training, 6 validation, 12 test. Features standardised (z-score). Tree models: 100–300 estimators with early stopping. LSTM: two layers (64, 32 units), dropout 0.2, look-back 6. ARIMA order via AIC minimisation. Prophet: yearly + monthly seasonality. Evaluation: RMSE, MAE, MAPE, R².</w:t>
       </w:r>
     </w:p>
     <w:p>
       <w:pPr>
-        <w:spacing w:after="40" w:before="60" w:line="220" w:lineRule="exact"/>
+        <w:spacing w:after="20" w:before="120" w:line="240" w:lineRule="exact"/>
         <w:jc w:val="both"/>
       </w:pPr>
       <w:r>
@@ -447,7 +447,7 @@
     </w:p>
     <w:p>
       <w:pPr>
-        <w:spacing w:after="0" w:before="0" w:line="220" w:lineRule="exact"/>
+        <w:spacing w:after="0" w:before="0" w:line="240" w:lineRule="exact"/>
         <w:jc w:val="both"/>
       </w:pPr>
       <w:r>
@@ -457,25 +457,25 @@
           <w:i w:val="0"/>
           <w:sz w:val="20"/>
         </w:rPr>
-        <w:t>Random Forest achieved the best overall performance (validation RMSE = 2.85, test R² = 0.31), outperforming XGBoost (RMSE = 3.12), LightGBM (3.41), and CatBoost (3.53). Linear models (LR: 4.12) and pure time-series models (ARIMA: 4.89, Prophet: 5.21) were less effective. The LSTM (RMSE = 3.98) underperformed relative to gradient-boosted trees due to limited training data (102 months). SHAP analysis identified international tourist arrivals (mean |SHAP| = 1.24) and the USD/THB exchange rate (0.98) as the two most influential predictors, consistent with the network centrality finding that USD/THB has the highest betweenness score. The Random Forest model captures directional price changes with moderate accuracy (Fig. 3). Figure 4 shows that network-derived features rank in the top half of variable importance, confirming that the SNA framework adds predictive value.</w:t>
+        <w:t>Random Forest achieved the best performance (validation RMSE = 2.85, test R² = 0.31), outperforming XGBoost (3.12), LightGBM (3.41), CatBoost (3.53), and LSTM (3.98). Linear and time-series models lagged (LR: 4.12, ARIMA: 4.89, Prophet: 5.21). SHAP analysis identifies tourist arrivals (mean |SHAP| = 1.24) and USD/THB (0.98) as the top predictors, consistent with USD/THB having the highest betweenness centrality in the network. Network-derived features ranked in the top half of variable importance, confirming the SNA framework adds predictive value beyond raw factor correlations.</w:t>
       </w:r>
     </w:p>
     <w:p>
       <w:pPr>
-        <w:spacing w:after="0" w:before="0" w:line="220" w:lineRule="exact"/>
+        <w:spacing w:after="0" w:before="508000" w:line="240" w:lineRule="exact"/>
         <w:jc w:val="both"/>
       </w:pPr>
     </w:p>
     <w:p>
       <w:pPr>
         <w:keepNext/>
-        <w:spacing w:after="0" w:before="0" w:line="220" w:lineRule="exact"/>
+        <w:spacing w:after="0" w:before="0" w:line="200" w:lineRule="exact"/>
         <w:jc w:val="center"/>
       </w:pPr>
       <w:r>
         <w:drawing>
           <wp:inline xmlns:a="http://schemas.openxmlformats.org/drawingml/2006/main" xmlns:pic="http://schemas.openxmlformats.org/drawingml/2006/picture">
-            <wp:extent cx="3960000" cy="2970000"/>
+            <wp:extent cx="4320000" cy="3240000"/>
             <wp:docPr id="4" name="Picture 4"/>
             <wp:cNvGraphicFramePr>
               <a:graphicFrameLocks noChangeAspect="1"/>
@@ -496,7 +496,7 @@
                   <pic:spPr>
                     <a:xfrm>
                       <a:off x="0" y="0"/>
-                      <a:ext cx="3960000" cy="2970000"/>
+                      <a:ext cx="4320000" cy="3240000"/>
                     </a:xfrm>
                     <a:prstGeom prst="rect"/>
                   </pic:spPr>
@@ -509,7 +509,7 @@
     </w:p>
     <w:p>
       <w:pPr>
-        <w:spacing w:after="40" w:before="0" w:line="220" w:lineRule="exact"/>
+        <w:spacing w:after="0" w:before="0" w:line="200" w:lineRule="exact"/>
         <w:jc w:val="center"/>
       </w:pPr>
       <w:r>
@@ -519,12 +519,12 @@
           <w:i/>
           <w:sz w:val="16"/>
         </w:rPr>
-        <w:t>Figure 3: Actual versus predicted AOT closing price on the 12-month test set using the Random Forest model. The model achieves R² = 0.31.</w:t>
+        <w:t>Figure 4: Actual versus predicted AOT closing price — Random Forest model on the 12-month test set (R² = 0.31). The model captures directional changes with moderate accuracy.</w:t>
       </w:r>
     </w:p>
     <w:sectPr>
       <w:pgSz w:w="11906" w:h="16838"/>
-      <w:pgMar w:top="1440" w:right="1440" w:bottom="1440" w:left="1440" w:header="720" w:footer="720" w:gutter="0"/>
+      <w:pgMar w:top="1020" w:right="1247" w:bottom="1020" w:left="1247" w:header="720" w:footer="720" w:gutter="0"/>
       <w:cols w:space="720"/>
       <w:docGrid w:linePitch="360"/>
     </w:sectPr>

</xml_diff>